<commit_message>
Agregué logo de la app en android, IOS y web, agregué pantalla de carga relacionada con la app (Se ve raro si está muy estirado al iniciar, pero renderiza bien en movil, modifiqué errores de vista en chrome)
</commit_message>
<xml_diff>
--- a/docs/planificacion/propuesta-flutter JP y SR.docx
+++ b/docs/planificacion/propuesta-flutter JP y SR.docx
@@ -2035,9 +2035,6 @@
           <w:bottom w:val="single" w:sz="4" w:space="4" w:color="AAAAAA"/>
         </w:pBdr>
         <w:spacing w:after="60"/>
-        <w:rPr>
-          <w:color w:val="888888"/>
-        </w:rPr>
       </w:pPr>
       <w:r>
         <w:rPr>
@@ -2046,23 +2043,14 @@
         <w:t xml:space="preserve">   </w:t>
       </w:r>
       <w:r>
-        <w:rPr>
-          <w:color w:val="888888"/>
-        </w:rPr>
         <w:t xml:space="preserve">Pueden salir mal las api </w:t>
       </w:r>
       <w:proofErr w:type="spellStart"/>
       <w:r>
-        <w:rPr>
-          <w:color w:val="888888"/>
-        </w:rPr>
         <w:t>call</w:t>
       </w:r>
       <w:proofErr w:type="spellEnd"/>
       <w:r>
-        <w:rPr>
-          <w:color w:val="888888"/>
-        </w:rPr>
         <w:t>, que no haya ninguna gratuita con suficientes créditos.</w:t>
       </w:r>
     </w:p>
@@ -2074,9 +2062,6 @@
         <w:spacing w:after="60"/>
       </w:pPr>
       <w:r>
-        <w:rPr>
-          <w:color w:val="888888"/>
-        </w:rPr>
         <w:t>Estamos asumiendo que compilará en todos los dispositivos, que es posible la visión actual del proyecto.</w:t>
       </w:r>
     </w:p>

</xml_diff>